<commit_message>
update word doc for module 6
</commit_message>
<xml_diff>
--- a/module-6/McCarthy_Assignment6.2.docx
+++ b/module-6/McCarthy_Assignment6.2.docx
@@ -14,6 +14,14 @@
     </w:p>
     <w:p>
       <w:r>
+        <w:t>https://github.com/YeetoNeto/csd-310/activity</w:t>
+      </w:r>
+    </w:p>
+    <w:p>
+      <w:r>
+        <w:rPr>
+          <w:noProof/>
+        </w:rPr>
         <w:drawing>
           <wp:inline distT="0" distB="0" distL="0" distR="0" wp14:anchorId="3E1E592D" wp14:editId="2D4FE22C">
             <wp:extent cx="4496427" cy="5811061"/>

</xml_diff>